<commit_message>
docs: add P1-3 acceptance docs and update project documentation
- Add Treeify_MVP_最终验收清单.md and 验收说明.md
- Update 开发需求文档, 前端开发计划, 项目图片分析文档
</commit_message>
<xml_diff>
--- a/Treeify_开发需求文档.docx
+++ b/Treeify_开发需求文档.docx
@@ -32,7 +32,7 @@
           <w:sz w:val="72"/>
           <w:szCs w:val="72"/>
         </w:rPr>
-        <w:t xml:space="preserve">Treeify</w:t>
+        <w:t xml:space="preserve">speccase</w:t>
       </w:r>
     </w:p>
     <w:p>
@@ -401,7 +401,7 @@
                 <w:sz w:val="19"/>
                 <w:szCs w:val="19"/>
               </w:rPr>
-              <w:t xml:space="preserve">Spring Boot · React · Spring AI · pgvector</w:t>
+              <w:t xml:space="preserve">Spring Boot · React · Spring AI · MySQL（P0）· pgvector（P1）</w:t>
             </w:r>
           </w:p>
         </w:tc>
@@ -1025,37 +1025,37 @@
                 <w:sz w:val="19"/>
                 <w:szCs w:val="19"/>
               </w:rPr>
-              <w:t xml:space="preserve">pgvector（PostgreSQL 扩展）</w:t>
-            </w:r>
-          </w:p>
-        </w:tc>
-        <w:tc>
-          <w:tcPr>
-            <w:tcBorders>
-              <w:top w:val="single" w:color="CCCCCC" w:sz="1"/>
-              <w:left w:val="single" w:color="CCCCCC" w:sz="1"/>
-              <w:bottom w:val="single" w:color="CCCCCC" w:sz="1"/>
-              <w:right w:val="single" w:color="CCCCCC" w:sz="1"/>
-            </w:tcBorders>
-            <w:shd w:fill="FFFFFF" w:val="clear"/>
-            <w:tcMar>
-              <w:top w:type="dxa" w:w="80"/>
-              <w:left w:type="dxa" w:w="120"/>
-              <w:bottom w:type="dxa" w:w="80"/>
-              <w:right w:type="dxa" w:w="120"/>
-            </w:tcMar>
-          </w:tcPr>
-          <w:p>
-            <w:r>
-              <w:rPr>
-                <w:rFonts w:ascii="Arial" w:cs="Arial" w:eastAsia="Arial" w:hAnsi="Arial"/>
-                <w:b w:val="false"/>
-                <w:bCs w:val="false"/>
-                <w:color w:val="111827"/>
-                <w:sz w:val="19"/>
-                <w:szCs w:val="19"/>
-              </w:rPr>
-              <w:t xml:space="preserve">与业务库合并，零额外运维</w:t>
+              <w:t xml:space="preserve">pgvector（PostgreSQL 扩展，P1）</w:t>
+            </w:r>
+          </w:p>
+        </w:tc>
+        <w:tc>
+          <w:tcPr>
+            <w:tcBorders>
+              <w:top w:val="single" w:color="CCCCCC" w:sz="1"/>
+              <w:left w:val="single" w:color="CCCCCC" w:sz="1"/>
+              <w:bottom w:val="single" w:color="CCCCCC" w:sz="1"/>
+              <w:right w:val="single" w:color="CCCCCC" w:sz="1"/>
+            </w:tcBorders>
+            <w:shd w:fill="FFFFFF" w:val="clear"/>
+            <w:tcMar>
+              <w:top w:type="dxa" w:w="80"/>
+              <w:left w:type="dxa" w:w="120"/>
+              <w:bottom w:type="dxa" w:w="80"/>
+              <w:right w:type="dxa" w:w="120"/>
+            </w:tcMar>
+          </w:tcPr>
+          <w:p>
+            <w:r>
+              <w:rPr>
+                <w:rFonts w:ascii="Arial" w:cs="Arial" w:eastAsia="Arial" w:hAnsi="Arial"/>
+                <w:b w:val="false"/>
+                <w:bCs w:val="false"/>
+                <w:color w:val="111827"/>
+                <w:sz w:val="19"/>
+                <w:szCs w:val="19"/>
+              </w:rPr>
+              <w:t xml:space="preserve">P0 不接入；P1 用于项目级 RAG 和历史用例语义召回</w:t>
             </w:r>
           </w:p>
         </w:tc>
@@ -2104,7 +2104,7 @@
                 <w:sz w:val="19"/>
                 <w:szCs w:val="19"/>
               </w:rPr>
-              <w:t xml:space="preserve">入库/检索/管理</w:t>
+              <w:t xml:space="preserve">P0 固定接口和 mock/关键词检索；P1 接 pgvector 入库/检索</w:t>
             </w:r>
           </w:p>
         </w:tc>
@@ -2406,7 +2406,7 @@
           <w:sz w:val="20"/>
           <w:szCs w:val="20"/>
         </w:rPr>
-        <w:t xml:space="preserve">  📌  MySQL 存业务数据；PostgreSQL + pgvector 存向量数据。两库通过 project_id 关联。</w:t>
+        <w:t xml:space="preserve">  📌  P0 只落 MySQL，优先固定 API 契约和生成主链路；P1 再接 PostgreSQL + pgvector 存向量数据，两库通过 project_id 关联。</w:t>
       </w:r>
     </w:p>
     <w:p>
@@ -5943,7 +5943,7 @@
                 <w:sz w:val="19"/>
                 <w:szCs w:val="19"/>
               </w:rPr>
-              <w:t xml:space="preserve">是否已向量化入库</w:t>
+              <w:t xml:space="preserve">是否已向量化入库（P1 字段，P0 可保留默认值）</w:t>
             </w:r>
           </w:p>
         </w:tc>
@@ -8140,7 +8140,7 @@
           <w:sz w:val="26"/>
           <w:szCs w:val="26"/>
         </w:rPr>
-        <w:t xml:space="preserve">2.2 pgvector 向量表</w:t>
+        <w:t xml:space="preserve">2.2 pgvector 向量表（P1）</w:t>
       </w:r>
     </w:p>
     <w:p>
@@ -10334,7 +10334,7 @@
           <w:sz w:val="21"/>
           <w:szCs w:val="21"/>
         </w:rPr>
-        <w:t xml:space="preserve">上传后异步触发摘要 Agent，返回 202 Accepted + task_id</w:t>
+        <w:t xml:space="preserve">上传后异步触发摘要 Agent，返回 202 Accepted + taskId</w:t>
       </w:r>
     </w:p>
     <w:p>
@@ -10353,7 +10353,7 @@
           <w:sz w:val="21"/>
           <w:szCs w:val="21"/>
         </w:rPr>
-        <w:t xml:space="preserve">前端轮询 GET /api/v1/tasks/{task_id} 获取摘要更新状态</w:t>
+        <w:t xml:space="preserve">前端轮询 GET /api/v1/tasks/{taskId} 获取摘要更新状态</w:t>
       </w:r>
     </w:p>
     <w:p>
@@ -10583,7 +10583,7 @@
                 <w:sz w:val="19"/>
                 <w:szCs w:val="19"/>
               </w:rPr>
-              <w:t xml:space="preserve">创建生成任务，返回 task_id</w:t>
+              <w:t xml:space="preserve">创建生成任务，返回 taskId</w:t>
             </w:r>
           </w:p>
         </w:tc>
@@ -11073,7 +11073,7 @@
           <w:sz w:val="18"/>
           <w:szCs w:val="18"/>
         </w:rPr>
-        <w:t xml:space="preserve">  "prd_document_id": 5     // 可选，关联已上传的 PRD 文档</w:t>
+        <w:t xml:space="preserve">  "prdDocumentId": 5     // 可选，关联已上传的 PRD 文档</w:t>
       </w:r>
     </w:p>
     <w:p>
@@ -11163,7 +11163,7 @@
           <w:sz w:val="18"/>
           <w:szCs w:val="18"/>
         </w:rPr>
-        <w:t xml:space="preserve">  "data": { "task_id": "a3f2c1d0-....", "stream_url": "/api/v1/generate/a3f2c1d0-.../stream" }</w:t>
+        <w:t xml:space="preserve">  "data": { "taskId": "a3f2c1d0-....", "streamUrl": "/api/v1/generate/a3f2c1d0-.../stream" }</w:t>
       </w:r>
     </w:p>
     <w:p>
@@ -11222,7 +11222,7 @@
           <w:sz w:val="18"/>
           <w:szCs w:val="18"/>
         </w:rPr>
-        <w:t xml:space="preserve">SSE Event: e1_start</w:t>
+        <w:t xml:space="preserve">SSE Event: stage_started</w:t>
       </w:r>
     </w:p>
     <w:p>
@@ -11238,7 +11238,7 @@
           <w:sz w:val="18"/>
           <w:szCs w:val="18"/>
         </w:rPr>
-        <w:t xml:space="preserve">data: { "event": "e1_start", "stage": "e1" }</w:t>
+        <w:t xml:space="preserve">data: { "event": "stage_started", "stage": "e1" }</w:t>
       </w:r>
     </w:p>
     <w:p>
@@ -11264,7 +11264,7 @@
           <w:sz w:val="18"/>
           <w:szCs w:val="18"/>
         </w:rPr>
-        <w:t xml:space="preserve">SSE Event: e1_chunk（流式内容）</w:t>
+        <w:t xml:space="preserve">SSE Event: stage_chunk（流式内容）</w:t>
       </w:r>
     </w:p>
     <w:p>
@@ -11280,7 +11280,7 @@
           <w:sz w:val="18"/>
           <w:szCs w:val="18"/>
         </w:rPr>
-        <w:t xml:space="preserve">data: { "event": "e1_chunk", "stage": "e1", "content": "抽取到功能点：用户登录..." }</w:t>
+        <w:t xml:space="preserve">data: { "event": "stage_chunk", "stage": "e1", "content": "抽取到功能点：用户登录..." }</w:t>
       </w:r>
     </w:p>
     <w:p>
@@ -11386,7 +11386,7 @@
           <w:sz w:val="18"/>
           <w:szCs w:val="18"/>
         </w:rPr>
-        <w:t xml:space="preserve">  "need_confirm": true    // step 模式为 true，auto 模式为 false</w:t>
+        <w:t xml:space="preserve">  "needConfirm": true    // step 模式为 true，auto 模式为 false</w:t>
       </w:r>
     </w:p>
     <w:p>
@@ -11476,7 +11476,7 @@
           <w:sz w:val="18"/>
           <w:szCs w:val="18"/>
         </w:rPr>
-        <w:t xml:space="preserve">  "critic_score": 88,</w:t>
+        <w:t xml:space="preserve">  "criticScore": 88,</w:t>
       </w:r>
     </w:p>
     <w:p>
@@ -12126,7 +12126,7 @@
                 <w:sz w:val="19"/>
                 <w:szCs w:val="19"/>
               </w:rPr>
-              <w:t xml:space="preserve">批量确认用例（触发向量化入库）</w:t>
+              <w:t xml:space="preserve">批量确认用例（P0 保存 MySQL；P1 异步触发向量化入库）</w:t>
             </w:r>
           </w:p>
         </w:tc>
@@ -12249,7 +12249,7 @@
           <w:sz w:val="26"/>
           <w:szCs w:val="26"/>
         </w:rPr>
-        <w:t xml:space="preserve">3.5 RAG 知识库 API</w:t>
+        <w:t xml:space="preserve">3.5 RAG 知识库 API（P1，P0 可先提供 mock/元信息）</w:t>
       </w:r>
     </w:p>
     <w:tbl>
@@ -12739,7 +12739,7 @@
                 <w:sz w:val="19"/>
                 <w:szCs w:val="19"/>
               </w:rPr>
-              <w:t xml:space="preserve">手动语义检索（调试用）</w:t>
+              <w:t xml:space="preserve">手动检索调试（P0 关键词/mock；P1 语义检索）</w:t>
             </w:r>
           </w:p>
         </w:tc>
@@ -12984,37 +12984,37 @@
                 <w:sz w:val="19"/>
                 <w:szCs w:val="19"/>
               </w:rPr>
-              <w:t xml:space="preserve">读项目摘要 + RAG Top-5 + 用户输入</w:t>
-            </w:r>
-          </w:p>
-        </w:tc>
-        <w:tc>
-          <w:tcPr>
-            <w:tcBorders>
-              <w:top w:val="single" w:color="CCCCCC" w:sz="1"/>
-              <w:left w:val="single" w:color="CCCCCC" w:sz="1"/>
-              <w:bottom w:val="single" w:color="CCCCCC" w:sz="1"/>
-              <w:right w:val="single" w:color="CCCCCC" w:sz="1"/>
-            </w:tcBorders>
-            <w:shd w:fill="FFFFFF" w:val="clear"/>
-            <w:tcMar>
-              <w:top w:type="dxa" w:w="80"/>
-              <w:left w:type="dxa" w:w="120"/>
-              <w:bottom w:type="dxa" w:w="80"/>
-              <w:right w:type="dxa" w:w="120"/>
-            </w:tcMar>
-          </w:tcPr>
-          <w:p>
-            <w:r>
-              <w:rPr>
-                <w:rFonts w:ascii="Arial" w:cs="Arial" w:eastAsia="Arial" w:hAnsi="Arial"/>
-                <w:b w:val="false"/>
-                <w:bCs w:val="false"/>
-                <w:color w:val="111827"/>
-                <w:sz w:val="19"/>
-                <w:szCs w:val="19"/>
-              </w:rPr>
-              <w:t xml:space="preserve">摘要不存在则跳过；RAG 无结果则不注入</w:t>
+              <w:t xml:space="preserve">读项目摘要 + 历史用例上下文 + 用户输入</w:t>
+            </w:r>
+          </w:p>
+        </w:tc>
+        <w:tc>
+          <w:tcPr>
+            <w:tcBorders>
+              <w:top w:val="single" w:color="CCCCCC" w:sz="1"/>
+              <w:left w:val="single" w:color="CCCCCC" w:sz="1"/>
+              <w:bottom w:val="single" w:color="CCCCCC" w:sz="1"/>
+              <w:right w:val="single" w:color="CCCCCC" w:sz="1"/>
+            </w:tcBorders>
+            <w:shd w:fill="FFFFFF" w:val="clear"/>
+            <w:tcMar>
+              <w:top w:type="dxa" w:w="80"/>
+              <w:left w:type="dxa" w:w="120"/>
+              <w:bottom w:type="dxa" w:w="80"/>
+              <w:right w:type="dxa" w:w="120"/>
+            </w:tcMar>
+          </w:tcPr>
+          <w:p>
+            <w:r>
+              <w:rPr>
+                <w:rFonts w:ascii="Arial" w:cs="Arial" w:eastAsia="Arial" w:hAnsi="Arial"/>
+                <w:b w:val="false"/>
+                <w:bCs w:val="false"/>
+                <w:color w:val="111827"/>
+                <w:sz w:val="19"/>
+                <w:szCs w:val="19"/>
+              </w:rPr>
+              <w:t xml:space="preserve">P0 用 MySQL/关键词检索；P1 替换为 RAG Top-5</w:t>
             </w:r>
           </w:p>
         </w:tc>
@@ -14052,7 +14052,7 @@
                 <w:sz w:val="19"/>
                 <w:szCs w:val="19"/>
               </w:rPr>
-              <w:t xml:space="preserve">pgvector 检索 Top-5 chunk 拼接</w:t>
+              <w:t xml:space="preserve">P0：MySQL/关键词检索的历史用例；P1：pgvector 检索 Top-5 chunk 拼接</w:t>
             </w:r>
           </w:p>
         </w:tc>
@@ -14441,7 +14441,10 @@
           <w:sz w:val="22"/>
           <w:szCs w:val="22"/>
         </w:rPr>
-        <w:t xml:space="preserve">4.3.1 混合检索策略</w:t>
+        <w:t xml:space="preserve">4.3.1 阶段策略
+- P0：不接 pgvector，先用 MySQL 读取最近确认用例 Top-20，并通过关键词过滤补充生成上下文；知识库接口可先返回 mock/文档元信息。
+- P1：接 PostgreSQL + pgvector，支持文档切片、embedding 入库、项目级语义召回和历史用例向量化。
+4.3.2 混合检索策略（P1）</w:t>
       </w:r>
     </w:p>
     <w:p>
@@ -14612,7 +14615,7 @@
           <w:sz w:val="22"/>
           <w:szCs w:val="22"/>
         </w:rPr>
-        <w:t xml:space="preserve">4.3.2 入库规范</w:t>
+        <w:t xml:space="preserve">4.3.3 入库规范（P1）</w:t>
       </w:r>
     </w:p>
     <w:p>
@@ -16536,7 +16539,7 @@
           <w:sz w:val="18"/>
           <w:szCs w:val="18"/>
         </w:rPr>
-        <w:t xml:space="preserve">        case 'e1_chunk': appendContent('e1', payload.content); break;</w:t>
+        <w:t xml:space="preserve">        case 'stage_chunk': appendContent(payload.stage, payload.payload.content); break;</w:t>
       </w:r>
     </w:p>
     <w:p>
@@ -16552,7 +16555,7 @@
           <w:sz w:val="18"/>
           <w:szCs w:val="18"/>
         </w:rPr>
-        <w:t xml:space="preserve">        case 'stage_done': markStageDone(payload); break;</w:t>
+        <w:t xml:space="preserve">        case 'stage_done': markStageDone(payload.stage, payload.payload); break;</w:t>
       </w:r>
     </w:p>
     <w:p>
@@ -16584,7 +16587,7 @@
           <w:sz w:val="18"/>
           <w:szCs w:val="18"/>
         </w:rPr>
-        <w:t xml:space="preserve">        case 'error': setStatus('failed'); es.close(); break;</w:t>
+        <w:t xml:space="preserve">        es.onerror = () =&gt; { setStatus('failed'); es.close(); };</w:t>
       </w:r>
     </w:p>
     <w:p>
@@ -19885,7 +19888,7 @@
                 <w:sz w:val="19"/>
                 <w:szCs w:val="19"/>
               </w:rPr>
-              <w:t xml:space="preserve">向量化入库失败</w:t>
+              <w:t xml:space="preserve">向量化入库失败（P1）</w:t>
             </w:r>
           </w:p>
         </w:tc>
@@ -20587,7 +20590,7 @@
                 <w:sz w:val="19"/>
                 <w:szCs w:val="19"/>
               </w:rPr>
-              <w:t xml:space="preserve">摘要 Agent、RAG 入库/检索、向量化异步任务</w:t>
+              <w:t xml:space="preserve">摘要 Agent、pgvector RAG 入库/检索、向量化异步任务</w:t>
             </w:r>
           </w:p>
         </w:tc>
@@ -20739,7 +20742,7 @@
           <w:sz w:val="20"/>
           <w:szCs w:val="20"/>
         </w:rPr>
-        <w:t xml:space="preserve">  📌  P0（必须完成）：Sprint 1-3 全部任务。P1（重要）：Sprint 4。P2（迭代）：Sprint 5。</w:t>
+        <w:t xml:space="preserve">  📌  P0（必须完成）：Sprint 1-3 全部任务，只固定契约和主链路，不接 pgvector。P1（重要）：Sprint 4 接 PostgreSQL + pgvector。P2（迭代）：Sprint 5。</w:t>
       </w:r>
     </w:p>
     <w:p>
@@ -20815,7 +20818,7 @@
         <w:sz w:val="17"/>
         <w:szCs w:val="17"/>
       </w:rPr>
-      <w:t xml:space="preserve">Treeify · 开发需求文档  </w:t>
+      <w:t xml:space="preserve">speccase · 开发需求文档  </w:t>
     </w:r>
     <w:r>
       <w:rPr>

</xml_diff>